<commit_message>
Add board member photos to the governance appendix
Board figure with circular photos from the Annual Report, name, profession and role; chairman
and independent director highlighted. Also fixes the ownership legend overlap in Spanish.

Co-Authored-By: Claude Opus 5.5 <noreply@anthropic.com>
Claude-Session: https://claude.ai/code/session_0188QZHBkA8n5QL7BtmFakQg
</commit_message>
<xml_diff>
--- a/informe/Mallplaza_ESG_EN.docx
+++ b/informe/Mallplaza_ESG_EN.docx
@@ -2484,1121 +2484,76 @@
         <w:t xml:space="preserve">2. BOARD OF DIRECTORS (ELECTED 22-APR-2025)</w:t>
       </w:r>
     </w:p>
-    <w:tbl>
-      <w:tblPr>
-        <w:tblW w:type="dxa" w:w="10666"/>
-        <w:tblBorders>
-          <w:top w:val="none" w:color="FFFFFF" w:sz="0"/>
-          <w:left w:val="none" w:color="FFFFFF" w:sz="0"/>
-          <w:bottom w:val="none" w:color="FFFFFF" w:sz="0"/>
-          <w:right w:val="none" w:color="FFFFFF" w:sz="0"/>
-          <w:insideH w:val="none" w:color="FFFFFF" w:sz="0"/>
-          <w:insideV w:val="none" w:color="FFFFFF" w:sz="0"/>
-        </w:tblBorders>
-      </w:tblPr>
-      <w:tblGrid>
-        <w:gridCol w:w="3600"/>
-        <w:gridCol w:w="2700"/>
-        <w:gridCol w:w="4366"/>
-      </w:tblGrid>
-      <w:tr>
-        <w:trPr>
-          <w:tblHeader/>
-        </w:trPr>
-        <w:tc>
-          <w:tcPr>
-            <w:tcW w:type="dxa" w:w="3600"/>
-            <w:tcBorders>
-              <w:top w:val="none" w:color="FFFFFF" w:sz="0"/>
-              <w:left w:val="none" w:color="FFFFFF" w:sz="0"/>
-              <w:bottom w:val="none" w:color="FFFFFF" w:sz="0"/>
-              <w:right w:val="none" w:color="FFFFFF" w:sz="0"/>
-            </w:tcBorders>
-            <w:shd w:fill="14284B" w:color="auto" w:val="clear"/>
-            <w:tcMar>
-              <w:top w:type="dxa" w:w="40"/>
-              <w:left w:type="dxa" w:w="90"/>
-              <w:bottom w:type="dxa" w:w="40"/>
-              <w:right w:type="dxa" w:w="90"/>
-            </w:tcMar>
-          </w:tcPr>
-          <w:p>
-            <w:pPr>
-              <w:jc w:val="left"/>
-            </w:pPr>
-            <w:r>
-              <w:rPr>
-                <w:rFonts w:ascii="Arial" w:cs="Arial" w:eastAsia="Arial" w:hAnsi="Arial"/>
-                <w:b/>
-                <w:bCs/>
-                <w:color w:val="FFFFFF"/>
-                <w:sz w:val="14"/>
-                <w:szCs w:val="14"/>
-              </w:rPr>
-              <w:t xml:space="preserve">Director</w:t>
-            </w:r>
-          </w:p>
-        </w:tc>
-        <w:tc>
-          <w:tcPr>
-            <w:tcW w:type="dxa" w:w="2700"/>
-            <w:tcBorders>
-              <w:top w:val="none" w:color="FFFFFF" w:sz="0"/>
-              <w:left w:val="none" w:color="FFFFFF" w:sz="0"/>
-              <w:bottom w:val="none" w:color="FFFFFF" w:sz="0"/>
-              <w:right w:val="none" w:color="FFFFFF" w:sz="0"/>
-            </w:tcBorders>
-            <w:shd w:fill="14284B" w:color="auto" w:val="clear"/>
-            <w:tcMar>
-              <w:top w:type="dxa" w:w="40"/>
-              <w:left w:type="dxa" w:w="90"/>
-              <w:bottom w:type="dxa" w:w="40"/>
-              <w:right w:type="dxa" w:w="90"/>
-            </w:tcMar>
-          </w:tcPr>
-          <w:p>
-            <w:pPr>
-              <w:jc w:val="left"/>
-            </w:pPr>
-            <w:r>
-              <w:rPr>
-                <w:rFonts w:ascii="Arial" w:cs="Arial" w:eastAsia="Arial" w:hAnsi="Arial"/>
-                <w:b/>
-                <w:bCs/>
-                <w:color w:val="FFFFFF"/>
-                <w:sz w:val="14"/>
-                <w:szCs w:val="14"/>
-              </w:rPr>
-              <w:t xml:space="preserve">Profession</w:t>
-            </w:r>
-          </w:p>
-        </w:tc>
-        <w:tc>
-          <w:tcPr>
-            <w:tcW w:type="dxa" w:w="4366"/>
-            <w:tcBorders>
-              <w:top w:val="none" w:color="FFFFFF" w:sz="0"/>
-              <w:left w:val="none" w:color="FFFFFF" w:sz="0"/>
-              <w:bottom w:val="none" w:color="FFFFFF" w:sz="0"/>
-              <w:right w:val="none" w:color="FFFFFF" w:sz="0"/>
-            </w:tcBorders>
-            <w:shd w:fill="14284B" w:color="auto" w:val="clear"/>
-            <w:tcMar>
-              <w:top w:type="dxa" w:w="40"/>
-              <w:left w:type="dxa" w:w="90"/>
-              <w:bottom w:type="dxa" w:w="40"/>
-              <w:right w:type="dxa" w:w="90"/>
-            </w:tcMar>
-          </w:tcPr>
-          <w:p>
-            <w:pPr>
-              <w:jc w:val="left"/>
-            </w:pPr>
-            <w:r>
-              <w:rPr>
-                <w:rFonts w:ascii="Arial" w:cs="Arial" w:eastAsia="Arial" w:hAnsi="Arial"/>
-                <w:b/>
-                <w:bCs/>
-                <w:color w:val="FFFFFF"/>
-                <w:sz w:val="14"/>
-                <w:szCs w:val="14"/>
-              </w:rPr>
-              <w:t xml:space="preserve">Position</w:t>
-            </w:r>
-          </w:p>
-        </w:tc>
-      </w:tr>
-      <w:tr>
-        <w:tc>
-          <w:tcPr>
-            <w:tcW w:type="dxa" w:w="3600"/>
-            <w:tcBorders>
-              <w:top w:val="none" w:color="FFFFFF" w:sz="0"/>
-              <w:left w:val="none" w:color="FFFFFF" w:sz="0"/>
-              <w:bottom w:val="single" w:color="D5D9E0" w:sz="4"/>
-              <w:right w:val="none" w:color="FFFFFF" w:sz="0"/>
-            </w:tcBorders>
-            <w:shd w:fill="F7F8FB" w:color="auto" w:val="clear"/>
-            <w:tcMar>
-              <w:top w:type="dxa" w:w="35"/>
-              <w:left w:type="dxa" w:w="90"/>
-              <w:bottom w:type="dxa" w:w="35"/>
-              <w:right w:type="dxa" w:w="90"/>
-            </w:tcMar>
-            <w:vAlign w:val="center"/>
-          </w:tcPr>
-          <w:p>
-            <w:pPr>
-              <w:spacing w:line="216" w:lineRule="auto"/>
-              <w:jc w:val="left"/>
-            </w:pPr>
-            <w:r>
-              <w:rPr>
-                <w:rFonts w:ascii="Arial" w:cs="Arial" w:eastAsia="Arial" w:hAnsi="Arial"/>
-                <w:b/>
-                <w:bCs/>
-                <w:color w:val="1A1A1A"/>
-                <w:sz w:val="14"/>
-                <w:szCs w:val="14"/>
-              </w:rPr>
-              <w:t xml:space="preserve">Sergio Cardone Solari</w:t>
-            </w:r>
-          </w:p>
-        </w:tc>
-        <w:tc>
-          <w:tcPr>
-            <w:tcW w:type="dxa" w:w="2700"/>
-            <w:tcBorders>
-              <w:top w:val="none" w:color="FFFFFF" w:sz="0"/>
-              <w:left w:val="none" w:color="FFFFFF" w:sz="0"/>
-              <w:bottom w:val="single" w:color="D5D9E0" w:sz="4"/>
-              <w:right w:val="none" w:color="FFFFFF" w:sz="0"/>
-            </w:tcBorders>
-            <w:shd w:fill="F7F8FB" w:color="auto" w:val="clear"/>
-            <w:tcMar>
-              <w:top w:type="dxa" w:w="35"/>
-              <w:left w:type="dxa" w:w="90"/>
-              <w:bottom w:type="dxa" w:w="35"/>
-              <w:right w:type="dxa" w:w="90"/>
-            </w:tcMar>
-            <w:vAlign w:val="center"/>
-          </w:tcPr>
-          <w:p>
-            <w:pPr>
-              <w:spacing w:line="216" w:lineRule="auto"/>
-              <w:jc w:val="left"/>
-            </w:pPr>
-            <w:r>
-              <w:rPr>
-                <w:rFonts w:ascii="Arial" w:cs="Arial" w:eastAsia="Arial" w:hAnsi="Arial"/>
-                <w:b w:val="false"/>
-                <w:bCs w:val="false"/>
-                <w:color w:val="1A1A1A"/>
-                <w:sz w:val="14"/>
-                <w:szCs w:val="14"/>
-              </w:rPr>
-              <w:t xml:space="preserve">Business engineer</w:t>
-            </w:r>
-          </w:p>
-        </w:tc>
-        <w:tc>
-          <w:tcPr>
-            <w:tcW w:type="dxa" w:w="4366"/>
-            <w:tcBorders>
-              <w:top w:val="none" w:color="FFFFFF" w:sz="0"/>
-              <w:left w:val="none" w:color="FFFFFF" w:sz="0"/>
-              <w:bottom w:val="single" w:color="D5D9E0" w:sz="4"/>
-              <w:right w:val="none" w:color="FFFFFF" w:sz="0"/>
-            </w:tcBorders>
-            <w:shd w:fill="F7F8FB" w:color="auto" w:val="clear"/>
-            <w:tcMar>
-              <w:top w:type="dxa" w:w="35"/>
-              <w:left w:type="dxa" w:w="90"/>
-              <w:bottom w:type="dxa" w:w="35"/>
-              <w:right w:type="dxa" w:w="90"/>
-            </w:tcMar>
-            <w:vAlign w:val="center"/>
-          </w:tcPr>
-          <w:p>
-            <w:pPr>
-              <w:spacing w:line="216" w:lineRule="auto"/>
-              <w:jc w:val="left"/>
-            </w:pPr>
-            <w:r>
-              <w:rPr>
-                <w:rFonts w:ascii="Arial" w:cs="Arial" w:eastAsia="Arial" w:hAnsi="Arial"/>
-                <w:b w:val="false"/>
-                <w:bCs w:val="false"/>
-                <w:color w:val="1A1A1A"/>
-                <w:sz w:val="14"/>
-                <w:szCs w:val="14"/>
-              </w:rPr>
-              <w:t xml:space="preserve">Chairman</w:t>
-            </w:r>
-          </w:p>
-        </w:tc>
-      </w:tr>
-      <w:tr>
-        <w:tc>
-          <w:tcPr>
-            <w:tcW w:type="dxa" w:w="3600"/>
-            <w:tcBorders>
-              <w:top w:val="none" w:color="FFFFFF" w:sz="0"/>
-              <w:left w:val="none" w:color="FFFFFF" w:sz="0"/>
-              <w:bottom w:val="single" w:color="D5D9E0" w:sz="4"/>
-              <w:right w:val="none" w:color="FFFFFF" w:sz="0"/>
-            </w:tcBorders>
-            <w:shd w:fill="FFFFFF" w:color="auto" w:val="clear"/>
-            <w:tcMar>
-              <w:top w:type="dxa" w:w="35"/>
-              <w:left w:type="dxa" w:w="90"/>
-              <w:bottom w:type="dxa" w:w="35"/>
-              <w:right w:type="dxa" w:w="90"/>
-            </w:tcMar>
-            <w:vAlign w:val="center"/>
-          </w:tcPr>
-          <w:p>
-            <w:pPr>
-              <w:spacing w:line="216" w:lineRule="auto"/>
-              <w:jc w:val="left"/>
-            </w:pPr>
-            <w:r>
-              <w:rPr>
-                <w:rFonts w:ascii="Arial" w:cs="Arial" w:eastAsia="Arial" w:hAnsi="Arial"/>
-                <w:b w:val="false"/>
-                <w:bCs w:val="false"/>
-                <w:color w:val="1A1A1A"/>
-                <w:sz w:val="14"/>
-                <w:szCs w:val="14"/>
-              </w:rPr>
-              <w:t xml:space="preserve">Paul Fürst Gwinner</w:t>
-            </w:r>
-          </w:p>
-        </w:tc>
-        <w:tc>
-          <w:tcPr>
-            <w:tcW w:type="dxa" w:w="2700"/>
-            <w:tcBorders>
-              <w:top w:val="none" w:color="FFFFFF" w:sz="0"/>
-              <w:left w:val="none" w:color="FFFFFF" w:sz="0"/>
-              <w:bottom w:val="single" w:color="D5D9E0" w:sz="4"/>
-              <w:right w:val="none" w:color="FFFFFF" w:sz="0"/>
-            </w:tcBorders>
-            <w:shd w:fill="FFFFFF" w:color="auto" w:val="clear"/>
-            <w:tcMar>
-              <w:top w:type="dxa" w:w="35"/>
-              <w:left w:type="dxa" w:w="90"/>
-              <w:bottom w:type="dxa" w:w="35"/>
-              <w:right w:type="dxa" w:w="90"/>
-            </w:tcMar>
-            <w:vAlign w:val="center"/>
-          </w:tcPr>
-          <w:p>
-            <w:pPr>
-              <w:spacing w:line="216" w:lineRule="auto"/>
-              <w:jc w:val="left"/>
-            </w:pPr>
-            <w:r>
-              <w:rPr>
-                <w:rFonts w:ascii="Arial" w:cs="Arial" w:eastAsia="Arial" w:hAnsi="Arial"/>
-                <w:b w:val="false"/>
-                <w:bCs w:val="false"/>
-                <w:color w:val="1A1A1A"/>
-                <w:sz w:val="14"/>
-                <w:szCs w:val="14"/>
-              </w:rPr>
-              <w:t xml:space="preserve">Business engineer</w:t>
-            </w:r>
-          </w:p>
-        </w:tc>
-        <w:tc>
-          <w:tcPr>
-            <w:tcW w:type="dxa" w:w="4366"/>
-            <w:tcBorders>
-              <w:top w:val="none" w:color="FFFFFF" w:sz="0"/>
-              <w:left w:val="none" w:color="FFFFFF" w:sz="0"/>
-              <w:bottom w:val="single" w:color="D5D9E0" w:sz="4"/>
-              <w:right w:val="none" w:color="FFFFFF" w:sz="0"/>
-            </w:tcBorders>
-            <w:shd w:fill="FFFFFF" w:color="auto" w:val="clear"/>
-            <w:tcMar>
-              <w:top w:type="dxa" w:w="35"/>
-              <w:left w:type="dxa" w:w="90"/>
-              <w:bottom w:type="dxa" w:w="35"/>
-              <w:right w:type="dxa" w:w="90"/>
-            </w:tcMar>
-            <w:vAlign w:val="center"/>
-          </w:tcPr>
-          <w:p>
-            <w:pPr>
-              <w:spacing w:line="216" w:lineRule="auto"/>
-              <w:jc w:val="left"/>
-            </w:pPr>
-            <w:r>
-              <w:rPr>
-                <w:rFonts w:ascii="Arial" w:cs="Arial" w:eastAsia="Arial" w:hAnsi="Arial"/>
-                <w:b w:val="false"/>
-                <w:bCs w:val="false"/>
-                <w:color w:val="1A1A1A"/>
-                <w:sz w:val="14"/>
-                <w:szCs w:val="14"/>
-              </w:rPr>
-              <w:t xml:space="preserve">Director</w:t>
-            </w:r>
-          </w:p>
-        </w:tc>
-      </w:tr>
-      <w:tr>
-        <w:tc>
-          <w:tcPr>
-            <w:tcW w:type="dxa" w:w="3600"/>
-            <w:tcBorders>
-              <w:top w:val="none" w:color="FFFFFF" w:sz="0"/>
-              <w:left w:val="none" w:color="FFFFFF" w:sz="0"/>
-              <w:bottom w:val="single" w:color="D5D9E0" w:sz="4"/>
-              <w:right w:val="none" w:color="FFFFFF" w:sz="0"/>
-            </w:tcBorders>
-            <w:shd w:fill="F7F8FB" w:color="auto" w:val="clear"/>
-            <w:tcMar>
-              <w:top w:type="dxa" w:w="35"/>
-              <w:left w:type="dxa" w:w="90"/>
-              <w:bottom w:type="dxa" w:w="35"/>
-              <w:right w:type="dxa" w:w="90"/>
-            </w:tcMar>
-            <w:vAlign w:val="center"/>
-          </w:tcPr>
-          <w:p>
-            <w:pPr>
-              <w:spacing w:line="216" w:lineRule="auto"/>
-              <w:jc w:val="left"/>
-            </w:pPr>
-            <w:r>
-              <w:rPr>
-                <w:rFonts w:ascii="Arial" w:cs="Arial" w:eastAsia="Arial" w:hAnsi="Arial"/>
-                <w:b w:val="false"/>
-                <w:bCs w:val="false"/>
-                <w:color w:val="1A1A1A"/>
-                <w:sz w:val="14"/>
-                <w:szCs w:val="14"/>
-              </w:rPr>
-              <w:t xml:space="preserve">Carlo Solari Donaggio</w:t>
-            </w:r>
-          </w:p>
-        </w:tc>
-        <w:tc>
-          <w:tcPr>
-            <w:tcW w:type="dxa" w:w="2700"/>
-            <w:tcBorders>
-              <w:top w:val="none" w:color="FFFFFF" w:sz="0"/>
-              <w:left w:val="none" w:color="FFFFFF" w:sz="0"/>
-              <w:bottom w:val="single" w:color="D5D9E0" w:sz="4"/>
-              <w:right w:val="none" w:color="FFFFFF" w:sz="0"/>
-            </w:tcBorders>
-            <w:shd w:fill="F7F8FB" w:color="auto" w:val="clear"/>
-            <w:tcMar>
-              <w:top w:type="dxa" w:w="35"/>
-              <w:left w:type="dxa" w:w="90"/>
-              <w:bottom w:type="dxa" w:w="35"/>
-              <w:right w:type="dxa" w:w="90"/>
-            </w:tcMar>
-            <w:vAlign w:val="center"/>
-          </w:tcPr>
-          <w:p>
-            <w:pPr>
-              <w:spacing w:line="216" w:lineRule="auto"/>
-              <w:jc w:val="left"/>
-            </w:pPr>
-            <w:r>
-              <w:rPr>
-                <w:rFonts w:ascii="Arial" w:cs="Arial" w:eastAsia="Arial" w:hAnsi="Arial"/>
-                <w:b w:val="false"/>
-                <w:bCs w:val="false"/>
-                <w:color w:val="1A1A1A"/>
-                <w:sz w:val="14"/>
-                <w:szCs w:val="14"/>
-              </w:rPr>
-              <w:t xml:space="preserve">Civil engineer</w:t>
-            </w:r>
-          </w:p>
-        </w:tc>
-        <w:tc>
-          <w:tcPr>
-            <w:tcW w:type="dxa" w:w="4366"/>
-            <w:tcBorders>
-              <w:top w:val="none" w:color="FFFFFF" w:sz="0"/>
-              <w:left w:val="none" w:color="FFFFFF" w:sz="0"/>
-              <w:bottom w:val="single" w:color="D5D9E0" w:sz="4"/>
-              <w:right w:val="none" w:color="FFFFFF" w:sz="0"/>
-            </w:tcBorders>
-            <w:shd w:fill="F7F8FB" w:color="auto" w:val="clear"/>
-            <w:tcMar>
-              <w:top w:type="dxa" w:w="35"/>
-              <w:left w:type="dxa" w:w="90"/>
-              <w:bottom w:type="dxa" w:w="35"/>
-              <w:right w:type="dxa" w:w="90"/>
-            </w:tcMar>
-            <w:vAlign w:val="center"/>
-          </w:tcPr>
-          <w:p>
-            <w:pPr>
-              <w:spacing w:line="216" w:lineRule="auto"/>
-              <w:jc w:val="left"/>
-            </w:pPr>
-            <w:r>
-              <w:rPr>
-                <w:rFonts w:ascii="Arial" w:cs="Arial" w:eastAsia="Arial" w:hAnsi="Arial"/>
-                <w:b w:val="false"/>
-                <w:bCs w:val="false"/>
-                <w:color w:val="1A1A1A"/>
-                <w:sz w:val="14"/>
-                <w:szCs w:val="14"/>
-              </w:rPr>
-              <w:t xml:space="preserve">Director</w:t>
-            </w:r>
-          </w:p>
-        </w:tc>
-      </w:tr>
-      <w:tr>
-        <w:tc>
-          <w:tcPr>
-            <w:tcW w:type="dxa" w:w="3600"/>
-            <w:tcBorders>
-              <w:top w:val="none" w:color="FFFFFF" w:sz="0"/>
-              <w:left w:val="none" w:color="FFFFFF" w:sz="0"/>
-              <w:bottom w:val="single" w:color="D5D9E0" w:sz="4"/>
-              <w:right w:val="none" w:color="FFFFFF" w:sz="0"/>
-            </w:tcBorders>
-            <w:shd w:fill="FFFFFF" w:color="auto" w:val="clear"/>
-            <w:tcMar>
-              <w:top w:type="dxa" w:w="35"/>
-              <w:left w:type="dxa" w:w="90"/>
-              <w:bottom w:type="dxa" w:w="35"/>
-              <w:right w:type="dxa" w:w="90"/>
-            </w:tcMar>
-            <w:vAlign w:val="center"/>
-          </w:tcPr>
-          <w:p>
-            <w:pPr>
-              <w:spacing w:line="216" w:lineRule="auto"/>
-              <w:jc w:val="left"/>
-            </w:pPr>
-            <w:r>
-              <w:rPr>
-                <w:rFonts w:ascii="Arial" w:cs="Arial" w:eastAsia="Arial" w:hAnsi="Arial"/>
-                <w:b w:val="false"/>
-                <w:bCs w:val="false"/>
-                <w:color w:val="1A1A1A"/>
-                <w:sz w:val="14"/>
-                <w:szCs w:val="14"/>
-              </w:rPr>
-              <w:t xml:space="preserve">Alejandro Puentes Bruno</w:t>
-            </w:r>
-          </w:p>
-        </w:tc>
-        <w:tc>
-          <w:tcPr>
-            <w:tcW w:type="dxa" w:w="2700"/>
-            <w:tcBorders>
-              <w:top w:val="none" w:color="FFFFFF" w:sz="0"/>
-              <w:left w:val="none" w:color="FFFFFF" w:sz="0"/>
-              <w:bottom w:val="single" w:color="D5D9E0" w:sz="4"/>
-              <w:right w:val="none" w:color="FFFFFF" w:sz="0"/>
-            </w:tcBorders>
-            <w:shd w:fill="FFFFFF" w:color="auto" w:val="clear"/>
-            <w:tcMar>
-              <w:top w:type="dxa" w:w="35"/>
-              <w:left w:type="dxa" w:w="90"/>
-              <w:bottom w:type="dxa" w:w="35"/>
-              <w:right w:type="dxa" w:w="90"/>
-            </w:tcMar>
-            <w:vAlign w:val="center"/>
-          </w:tcPr>
-          <w:p>
-            <w:pPr>
-              <w:spacing w:line="216" w:lineRule="auto"/>
-              <w:jc w:val="left"/>
-            </w:pPr>
-            <w:r>
-              <w:rPr>
-                <w:rFonts w:ascii="Arial" w:cs="Arial" w:eastAsia="Arial" w:hAnsi="Arial"/>
-                <w:b w:val="false"/>
-                <w:bCs w:val="false"/>
-                <w:color w:val="1A1A1A"/>
-                <w:sz w:val="14"/>
-                <w:szCs w:val="14"/>
-              </w:rPr>
-              <w:t xml:space="preserve">Business engineer</w:t>
-            </w:r>
-          </w:p>
-        </w:tc>
-        <w:tc>
-          <w:tcPr>
-            <w:tcW w:type="dxa" w:w="4366"/>
-            <w:tcBorders>
-              <w:top w:val="none" w:color="FFFFFF" w:sz="0"/>
-              <w:left w:val="none" w:color="FFFFFF" w:sz="0"/>
-              <w:bottom w:val="single" w:color="D5D9E0" w:sz="4"/>
-              <w:right w:val="none" w:color="FFFFFF" w:sz="0"/>
-            </w:tcBorders>
-            <w:shd w:fill="FFFFFF" w:color="auto" w:val="clear"/>
-            <w:tcMar>
-              <w:top w:type="dxa" w:w="35"/>
-              <w:left w:type="dxa" w:w="90"/>
-              <w:bottom w:type="dxa" w:w="35"/>
-              <w:right w:type="dxa" w:w="90"/>
-            </w:tcMar>
-            <w:vAlign w:val="center"/>
-          </w:tcPr>
-          <w:p>
-            <w:pPr>
-              <w:spacing w:line="216" w:lineRule="auto"/>
-              <w:jc w:val="left"/>
-            </w:pPr>
-            <w:r>
-              <w:rPr>
-                <w:rFonts w:ascii="Arial" w:cs="Arial" w:eastAsia="Arial" w:hAnsi="Arial"/>
-                <w:b w:val="false"/>
-                <w:bCs w:val="false"/>
-                <w:color w:val="1A1A1A"/>
-                <w:sz w:val="14"/>
-                <w:szCs w:val="14"/>
-              </w:rPr>
-              <w:t xml:space="preserve">Director</w:t>
-            </w:r>
-          </w:p>
-        </w:tc>
-      </w:tr>
-      <w:tr>
-        <w:tc>
-          <w:tcPr>
-            <w:tcW w:type="dxa" w:w="3600"/>
-            <w:tcBorders>
-              <w:top w:val="none" w:color="FFFFFF" w:sz="0"/>
-              <w:left w:val="none" w:color="FFFFFF" w:sz="0"/>
-              <w:bottom w:val="single" w:color="D5D9E0" w:sz="4"/>
-              <w:right w:val="none" w:color="FFFFFF" w:sz="0"/>
-            </w:tcBorders>
-            <w:shd w:fill="F7F8FB" w:color="auto" w:val="clear"/>
-            <w:tcMar>
-              <w:top w:type="dxa" w:w="35"/>
-              <w:left w:type="dxa" w:w="90"/>
-              <w:bottom w:type="dxa" w:w="35"/>
-              <w:right w:type="dxa" w:w="90"/>
-            </w:tcMar>
-            <w:vAlign w:val="center"/>
-          </w:tcPr>
-          <w:p>
-            <w:pPr>
-              <w:spacing w:line="216" w:lineRule="auto"/>
-              <w:jc w:val="left"/>
-            </w:pPr>
-            <w:r>
-              <w:rPr>
-                <w:rFonts w:ascii="Arial" w:cs="Arial" w:eastAsia="Arial" w:hAnsi="Arial"/>
-                <w:b w:val="false"/>
-                <w:bCs w:val="false"/>
-                <w:color w:val="1A1A1A"/>
-                <w:sz w:val="14"/>
-                <w:szCs w:val="14"/>
-              </w:rPr>
-              <w:t xml:space="preserve">Pablo Eyzaguirre Court</w:t>
-            </w:r>
-          </w:p>
-        </w:tc>
-        <w:tc>
-          <w:tcPr>
-            <w:tcW w:type="dxa" w:w="2700"/>
-            <w:tcBorders>
-              <w:top w:val="none" w:color="FFFFFF" w:sz="0"/>
-              <w:left w:val="none" w:color="FFFFFF" w:sz="0"/>
-              <w:bottom w:val="single" w:color="D5D9E0" w:sz="4"/>
-              <w:right w:val="none" w:color="FFFFFF" w:sz="0"/>
-            </w:tcBorders>
-            <w:shd w:fill="F7F8FB" w:color="auto" w:val="clear"/>
-            <w:tcMar>
-              <w:top w:type="dxa" w:w="35"/>
-              <w:left w:type="dxa" w:w="90"/>
-              <w:bottom w:type="dxa" w:w="35"/>
-              <w:right w:type="dxa" w:w="90"/>
-            </w:tcMar>
-            <w:vAlign w:val="center"/>
-          </w:tcPr>
-          <w:p>
-            <w:pPr>
-              <w:spacing w:line="216" w:lineRule="auto"/>
-              <w:jc w:val="left"/>
-            </w:pPr>
-            <w:r>
-              <w:rPr>
-                <w:rFonts w:ascii="Arial" w:cs="Arial" w:eastAsia="Arial" w:hAnsi="Arial"/>
-                <w:b w:val="false"/>
-                <w:bCs w:val="false"/>
-                <w:color w:val="1A1A1A"/>
-                <w:sz w:val="14"/>
-                <w:szCs w:val="14"/>
-              </w:rPr>
-              <w:t xml:space="preserve">Civil engineer</w:t>
-            </w:r>
-          </w:p>
-        </w:tc>
-        <w:tc>
-          <w:tcPr>
-            <w:tcW w:type="dxa" w:w="4366"/>
-            <w:tcBorders>
-              <w:top w:val="none" w:color="FFFFFF" w:sz="0"/>
-              <w:left w:val="none" w:color="FFFFFF" w:sz="0"/>
-              <w:bottom w:val="single" w:color="D5D9E0" w:sz="4"/>
-              <w:right w:val="none" w:color="FFFFFF" w:sz="0"/>
-            </w:tcBorders>
-            <w:shd w:fill="F7F8FB" w:color="auto" w:val="clear"/>
-            <w:tcMar>
-              <w:top w:type="dxa" w:w="35"/>
-              <w:left w:type="dxa" w:w="90"/>
-              <w:bottom w:type="dxa" w:w="35"/>
-              <w:right w:type="dxa" w:w="90"/>
-            </w:tcMar>
-            <w:vAlign w:val="center"/>
-          </w:tcPr>
-          <w:p>
-            <w:pPr>
-              <w:spacing w:line="216" w:lineRule="auto"/>
-              <w:jc w:val="left"/>
-            </w:pPr>
-            <w:r>
-              <w:rPr>
-                <w:rFonts w:ascii="Arial" w:cs="Arial" w:eastAsia="Arial" w:hAnsi="Arial"/>
-                <w:b w:val="false"/>
-                <w:bCs w:val="false"/>
-                <w:color w:val="1A1A1A"/>
-                <w:sz w:val="14"/>
-                <w:szCs w:val="14"/>
-              </w:rPr>
-              <w:t xml:space="preserve">Director</w:t>
-            </w:r>
-          </w:p>
-        </w:tc>
-      </w:tr>
-      <w:tr>
-        <w:tc>
-          <w:tcPr>
-            <w:tcW w:type="dxa" w:w="3600"/>
-            <w:tcBorders>
-              <w:top w:val="none" w:color="FFFFFF" w:sz="0"/>
-              <w:left w:val="none" w:color="FFFFFF" w:sz="0"/>
-              <w:bottom w:val="single" w:color="D5D9E0" w:sz="4"/>
-              <w:right w:val="none" w:color="FFFFFF" w:sz="0"/>
-            </w:tcBorders>
-            <w:shd w:fill="FFFFFF" w:color="auto" w:val="clear"/>
-            <w:tcMar>
-              <w:top w:type="dxa" w:w="35"/>
-              <w:left w:type="dxa" w:w="90"/>
-              <w:bottom w:type="dxa" w:w="35"/>
-              <w:right w:type="dxa" w:w="90"/>
-            </w:tcMar>
-            <w:vAlign w:val="center"/>
-          </w:tcPr>
-          <w:p>
-            <w:pPr>
-              <w:spacing w:line="216" w:lineRule="auto"/>
-              <w:jc w:val="left"/>
-            </w:pPr>
-            <w:r>
-              <w:rPr>
-                <w:rFonts w:ascii="Arial" w:cs="Arial" w:eastAsia="Arial" w:hAnsi="Arial"/>
-                <w:b w:val="false"/>
-                <w:bCs w:val="false"/>
-                <w:color w:val="1A1A1A"/>
-                <w:sz w:val="14"/>
-                <w:szCs w:val="14"/>
-              </w:rPr>
-              <w:t xml:space="preserve">Dafne González Lizama</w:t>
-            </w:r>
-          </w:p>
-        </w:tc>
-        <w:tc>
-          <w:tcPr>
-            <w:tcW w:type="dxa" w:w="2700"/>
-            <w:tcBorders>
-              <w:top w:val="none" w:color="FFFFFF" w:sz="0"/>
-              <w:left w:val="none" w:color="FFFFFF" w:sz="0"/>
-              <w:bottom w:val="single" w:color="D5D9E0" w:sz="4"/>
-              <w:right w:val="none" w:color="FFFFFF" w:sz="0"/>
-            </w:tcBorders>
-            <w:shd w:fill="FFFFFF" w:color="auto" w:val="clear"/>
-            <w:tcMar>
-              <w:top w:type="dxa" w:w="35"/>
-              <w:left w:type="dxa" w:w="90"/>
-              <w:bottom w:type="dxa" w:w="35"/>
-              <w:right w:type="dxa" w:w="90"/>
-            </w:tcMar>
-            <w:vAlign w:val="center"/>
-          </w:tcPr>
-          <w:p>
-            <w:pPr>
-              <w:spacing w:line="216" w:lineRule="auto"/>
-              <w:jc w:val="left"/>
-            </w:pPr>
-            <w:r>
-              <w:rPr>
-                <w:rFonts w:ascii="Arial" w:cs="Arial" w:eastAsia="Arial" w:hAnsi="Arial"/>
-                <w:b w:val="false"/>
-                <w:bCs w:val="false"/>
-                <w:color w:val="1A1A1A"/>
-                <w:sz w:val="14"/>
-                <w:szCs w:val="14"/>
-              </w:rPr>
-              <w:t xml:space="preserve">Lawyer</w:t>
-            </w:r>
-          </w:p>
-        </w:tc>
-        <w:tc>
-          <w:tcPr>
-            <w:tcW w:type="dxa" w:w="4366"/>
-            <w:tcBorders>
-              <w:top w:val="none" w:color="FFFFFF" w:sz="0"/>
-              <w:left w:val="none" w:color="FFFFFF" w:sz="0"/>
-              <w:bottom w:val="single" w:color="D5D9E0" w:sz="4"/>
-              <w:right w:val="none" w:color="FFFFFF" w:sz="0"/>
-            </w:tcBorders>
-            <w:shd w:fill="FFFFFF" w:color="auto" w:val="clear"/>
-            <w:tcMar>
-              <w:top w:type="dxa" w:w="35"/>
-              <w:left w:type="dxa" w:w="90"/>
-              <w:bottom w:type="dxa" w:w="35"/>
-              <w:right w:type="dxa" w:w="90"/>
-            </w:tcMar>
-            <w:vAlign w:val="center"/>
-          </w:tcPr>
-          <w:p>
-            <w:pPr>
-              <w:spacing w:line="216" w:lineRule="auto"/>
-              <w:jc w:val="left"/>
-            </w:pPr>
-            <w:r>
-              <w:rPr>
-                <w:rFonts w:ascii="Arial" w:cs="Arial" w:eastAsia="Arial" w:hAnsi="Arial"/>
-                <w:b w:val="false"/>
-                <w:bCs w:val="false"/>
-                <w:color w:val="1A1A1A"/>
-                <w:sz w:val="14"/>
-                <w:szCs w:val="14"/>
-              </w:rPr>
-              <w:t xml:space="preserve">Director</w:t>
-            </w:r>
-          </w:p>
-        </w:tc>
-      </w:tr>
-      <w:tr>
-        <w:tc>
-          <w:tcPr>
-            <w:tcW w:type="dxa" w:w="3600"/>
-            <w:tcBorders>
-              <w:top w:val="none" w:color="FFFFFF" w:sz="0"/>
-              <w:left w:val="none" w:color="FFFFFF" w:sz="0"/>
-              <w:bottom w:val="single" w:color="D5D9E0" w:sz="4"/>
-              <w:right w:val="none" w:color="FFFFFF" w:sz="0"/>
-            </w:tcBorders>
-            <w:shd w:fill="F7F8FB" w:color="auto" w:val="clear"/>
-            <w:tcMar>
-              <w:top w:type="dxa" w:w="35"/>
-              <w:left w:type="dxa" w:w="90"/>
-              <w:bottom w:type="dxa" w:w="35"/>
-              <w:right w:type="dxa" w:w="90"/>
-            </w:tcMar>
-            <w:vAlign w:val="center"/>
-          </w:tcPr>
-          <w:p>
-            <w:pPr>
-              <w:spacing w:line="216" w:lineRule="auto"/>
-              <w:jc w:val="left"/>
-            </w:pPr>
-            <w:r>
-              <w:rPr>
-                <w:rFonts w:ascii="Arial" w:cs="Arial" w:eastAsia="Arial" w:hAnsi="Arial"/>
-                <w:b w:val="false"/>
-                <w:bCs w:val="false"/>
-                <w:color w:val="1A1A1A"/>
-                <w:sz w:val="14"/>
-                <w:szCs w:val="14"/>
-              </w:rPr>
-              <w:t xml:space="preserve">Enrique Ostalé Cambiaso</w:t>
-            </w:r>
-          </w:p>
-        </w:tc>
-        <w:tc>
-          <w:tcPr>
-            <w:tcW w:type="dxa" w:w="2700"/>
-            <w:tcBorders>
-              <w:top w:val="none" w:color="FFFFFF" w:sz="0"/>
-              <w:left w:val="none" w:color="FFFFFF" w:sz="0"/>
-              <w:bottom w:val="single" w:color="D5D9E0" w:sz="4"/>
-              <w:right w:val="none" w:color="FFFFFF" w:sz="0"/>
-            </w:tcBorders>
-            <w:shd w:fill="F7F8FB" w:color="auto" w:val="clear"/>
-            <w:tcMar>
-              <w:top w:type="dxa" w:w="35"/>
-              <w:left w:type="dxa" w:w="90"/>
-              <w:bottom w:type="dxa" w:w="35"/>
-              <w:right w:type="dxa" w:w="90"/>
-            </w:tcMar>
-            <w:vAlign w:val="center"/>
-          </w:tcPr>
-          <w:p>
-            <w:pPr>
-              <w:spacing w:line="216" w:lineRule="auto"/>
-              <w:jc w:val="left"/>
-            </w:pPr>
-            <w:r>
-              <w:rPr>
-                <w:rFonts w:ascii="Arial" w:cs="Arial" w:eastAsia="Arial" w:hAnsi="Arial"/>
-                <w:b w:val="false"/>
-                <w:bCs w:val="false"/>
-                <w:color w:val="1A1A1A"/>
-                <w:sz w:val="14"/>
-                <w:szCs w:val="14"/>
-              </w:rPr>
-              <w:t xml:space="preserve">Business engineer</w:t>
-            </w:r>
-          </w:p>
-        </w:tc>
-        <w:tc>
-          <w:tcPr>
-            <w:tcW w:type="dxa" w:w="4366"/>
-            <w:tcBorders>
-              <w:top w:val="none" w:color="FFFFFF" w:sz="0"/>
-              <w:left w:val="none" w:color="FFFFFF" w:sz="0"/>
-              <w:bottom w:val="single" w:color="D5D9E0" w:sz="4"/>
-              <w:right w:val="none" w:color="FFFFFF" w:sz="0"/>
-            </w:tcBorders>
-            <w:shd w:fill="F7F8FB" w:color="auto" w:val="clear"/>
-            <w:tcMar>
-              <w:top w:type="dxa" w:w="35"/>
-              <w:left w:type="dxa" w:w="90"/>
-              <w:bottom w:type="dxa" w:w="35"/>
-              <w:right w:type="dxa" w:w="90"/>
-            </w:tcMar>
-            <w:vAlign w:val="center"/>
-          </w:tcPr>
-          <w:p>
-            <w:pPr>
-              <w:spacing w:line="216" w:lineRule="auto"/>
-              <w:jc w:val="left"/>
-            </w:pPr>
-            <w:r>
-              <w:rPr>
-                <w:rFonts w:ascii="Arial" w:cs="Arial" w:eastAsia="Arial" w:hAnsi="Arial"/>
-                <w:b w:val="false"/>
-                <w:bCs w:val="false"/>
-                <w:color w:val="1A1A1A"/>
-                <w:sz w:val="14"/>
-                <w:szCs w:val="14"/>
-              </w:rPr>
-              <w:t xml:space="preserve">Director</w:t>
-            </w:r>
-          </w:p>
-        </w:tc>
-      </w:tr>
-      <w:tr>
-        <w:tc>
-          <w:tcPr>
-            <w:tcW w:type="dxa" w:w="3600"/>
-            <w:tcBorders>
-              <w:top w:val="none" w:color="FFFFFF" w:sz="0"/>
-              <w:left w:val="none" w:color="FFFFFF" w:sz="0"/>
-              <w:bottom w:val="single" w:color="D5D9E0" w:sz="4"/>
-              <w:right w:val="none" w:color="FFFFFF" w:sz="0"/>
-            </w:tcBorders>
-            <w:shd w:fill="FFFFFF" w:color="auto" w:val="clear"/>
-            <w:tcMar>
-              <w:top w:type="dxa" w:w="35"/>
-              <w:left w:type="dxa" w:w="90"/>
-              <w:bottom w:type="dxa" w:w="35"/>
-              <w:right w:type="dxa" w:w="90"/>
-            </w:tcMar>
-            <w:vAlign w:val="center"/>
-          </w:tcPr>
-          <w:p>
-            <w:pPr>
-              <w:spacing w:line="216" w:lineRule="auto"/>
-              <w:jc w:val="left"/>
-            </w:pPr>
-            <w:r>
-              <w:rPr>
-                <w:rFonts w:ascii="Arial" w:cs="Arial" w:eastAsia="Arial" w:hAnsi="Arial"/>
-                <w:b w:val="false"/>
-                <w:bCs w:val="false"/>
-                <w:color w:val="1A1A1A"/>
-                <w:sz w:val="14"/>
-                <w:szCs w:val="14"/>
-              </w:rPr>
-              <w:t xml:space="preserve">Ian Fürst Garmendia</w:t>
-            </w:r>
-          </w:p>
-        </w:tc>
-        <w:tc>
-          <w:tcPr>
-            <w:tcW w:type="dxa" w:w="2700"/>
-            <w:tcBorders>
-              <w:top w:val="none" w:color="FFFFFF" w:sz="0"/>
-              <w:left w:val="none" w:color="FFFFFF" w:sz="0"/>
-              <w:bottom w:val="single" w:color="D5D9E0" w:sz="4"/>
-              <w:right w:val="none" w:color="FFFFFF" w:sz="0"/>
-            </w:tcBorders>
-            <w:shd w:fill="FFFFFF" w:color="auto" w:val="clear"/>
-            <w:tcMar>
-              <w:top w:type="dxa" w:w="35"/>
-              <w:left w:type="dxa" w:w="90"/>
-              <w:bottom w:type="dxa" w:w="35"/>
-              <w:right w:type="dxa" w:w="90"/>
-            </w:tcMar>
-            <w:vAlign w:val="center"/>
-          </w:tcPr>
-          <w:p>
-            <w:pPr>
-              <w:spacing w:line="216" w:lineRule="auto"/>
-              <w:jc w:val="left"/>
-            </w:pPr>
-            <w:r>
-              <w:rPr>
-                <w:rFonts w:ascii="Arial" w:cs="Arial" w:eastAsia="Arial" w:hAnsi="Arial"/>
-                <w:b w:val="false"/>
-                <w:bCs w:val="false"/>
-                <w:color w:val="1A1A1A"/>
-                <w:sz w:val="14"/>
-                <w:szCs w:val="14"/>
-              </w:rPr>
-              <w:t xml:space="preserve">Business engineer</w:t>
-            </w:r>
-          </w:p>
-        </w:tc>
-        <w:tc>
-          <w:tcPr>
-            <w:tcW w:type="dxa" w:w="4366"/>
-            <w:tcBorders>
-              <w:top w:val="none" w:color="FFFFFF" w:sz="0"/>
-              <w:left w:val="none" w:color="FFFFFF" w:sz="0"/>
-              <w:bottom w:val="single" w:color="D5D9E0" w:sz="4"/>
-              <w:right w:val="none" w:color="FFFFFF" w:sz="0"/>
-            </w:tcBorders>
-            <w:shd w:fill="FFFFFF" w:color="auto" w:val="clear"/>
-            <w:tcMar>
-              <w:top w:type="dxa" w:w="35"/>
-              <w:left w:type="dxa" w:w="90"/>
-              <w:bottom w:type="dxa" w:w="35"/>
-              <w:right w:type="dxa" w:w="90"/>
-            </w:tcMar>
-            <w:vAlign w:val="center"/>
-          </w:tcPr>
-          <w:p>
-            <w:pPr>
-              <w:spacing w:line="216" w:lineRule="auto"/>
-              <w:jc w:val="left"/>
-            </w:pPr>
-            <w:r>
-              <w:rPr>
-                <w:rFonts w:ascii="Arial" w:cs="Arial" w:eastAsia="Arial" w:hAnsi="Arial"/>
-                <w:b w:val="false"/>
-                <w:bCs w:val="false"/>
-                <w:color w:val="1A1A1A"/>
-                <w:sz w:val="14"/>
-                <w:szCs w:val="14"/>
-              </w:rPr>
-              <w:t xml:space="preserve">Director</w:t>
-            </w:r>
-          </w:p>
-        </w:tc>
-      </w:tr>
-      <w:tr>
-        <w:tc>
-          <w:tcPr>
-            <w:tcW w:type="dxa" w:w="3600"/>
-            <w:tcBorders>
-              <w:top w:val="none" w:color="FFFFFF" w:sz="0"/>
-              <w:left w:val="none" w:color="FFFFFF" w:sz="0"/>
-              <w:bottom w:val="single" w:color="D5D9E0" w:sz="4"/>
-              <w:right w:val="none" w:color="FFFFFF" w:sz="0"/>
-            </w:tcBorders>
-            <w:shd w:fill="F7F8FB" w:color="auto" w:val="clear"/>
-            <w:tcMar>
-              <w:top w:type="dxa" w:w="35"/>
-              <w:left w:type="dxa" w:w="90"/>
-              <w:bottom w:type="dxa" w:w="35"/>
-              <w:right w:type="dxa" w:w="90"/>
-            </w:tcMar>
-            <w:vAlign w:val="center"/>
-          </w:tcPr>
-          <w:p>
-            <w:pPr>
-              <w:spacing w:line="216" w:lineRule="auto"/>
-              <w:jc w:val="left"/>
-            </w:pPr>
-            <w:r>
-              <w:rPr>
-                <w:rFonts w:ascii="Arial" w:cs="Arial" w:eastAsia="Arial" w:hAnsi="Arial"/>
-                <w:b w:val="false"/>
-                <w:bCs w:val="false"/>
-                <w:color w:val="1A1A1A"/>
-                <w:sz w:val="14"/>
-                <w:szCs w:val="14"/>
-              </w:rPr>
-              <w:t xml:space="preserve">Manuel Ovalle Edwards</w:t>
-            </w:r>
-          </w:p>
-        </w:tc>
-        <w:tc>
-          <w:tcPr>
-            <w:tcW w:type="dxa" w:w="2700"/>
-            <w:tcBorders>
-              <w:top w:val="none" w:color="FFFFFF" w:sz="0"/>
-              <w:left w:val="none" w:color="FFFFFF" w:sz="0"/>
-              <w:bottom w:val="single" w:color="D5D9E0" w:sz="4"/>
-              <w:right w:val="none" w:color="FFFFFF" w:sz="0"/>
-            </w:tcBorders>
-            <w:shd w:fill="F7F8FB" w:color="auto" w:val="clear"/>
-            <w:tcMar>
-              <w:top w:type="dxa" w:w="35"/>
-              <w:left w:type="dxa" w:w="90"/>
-              <w:bottom w:type="dxa" w:w="35"/>
-              <w:right w:type="dxa" w:w="90"/>
-            </w:tcMar>
-            <w:vAlign w:val="center"/>
-          </w:tcPr>
-          <w:p>
-            <w:pPr>
-              <w:spacing w:line="216" w:lineRule="auto"/>
-              <w:jc w:val="left"/>
-            </w:pPr>
-            <w:r>
-              <w:rPr>
-                <w:rFonts w:ascii="Arial" w:cs="Arial" w:eastAsia="Arial" w:hAnsi="Arial"/>
-                <w:b w:val="false"/>
-                <w:bCs w:val="false"/>
-                <w:color w:val="1A1A1A"/>
-                <w:sz w:val="14"/>
-                <w:szCs w:val="14"/>
-              </w:rPr>
-              <w:t xml:space="preserve">Civil engineer</w:t>
-            </w:r>
-          </w:p>
-        </w:tc>
-        <w:tc>
-          <w:tcPr>
-            <w:tcW w:type="dxa" w:w="4366"/>
-            <w:tcBorders>
-              <w:top w:val="none" w:color="FFFFFF" w:sz="0"/>
-              <w:left w:val="none" w:color="FFFFFF" w:sz="0"/>
-              <w:bottom w:val="single" w:color="D5D9E0" w:sz="4"/>
-              <w:right w:val="none" w:color="FFFFFF" w:sz="0"/>
-            </w:tcBorders>
-            <w:shd w:fill="F7F8FB" w:color="auto" w:val="clear"/>
-            <w:tcMar>
-              <w:top w:type="dxa" w:w="35"/>
-              <w:left w:type="dxa" w:w="90"/>
-              <w:bottom w:type="dxa" w:w="35"/>
-              <w:right w:type="dxa" w:w="90"/>
-            </w:tcMar>
-            <w:vAlign w:val="center"/>
-          </w:tcPr>
-          <w:p>
-            <w:pPr>
-              <w:spacing w:line="216" w:lineRule="auto"/>
-              <w:jc w:val="left"/>
-            </w:pPr>
-            <w:r>
-              <w:rPr>
-                <w:rFonts w:ascii="Arial" w:cs="Arial" w:eastAsia="Arial" w:hAnsi="Arial"/>
-                <w:b w:val="false"/>
-                <w:bCs w:val="false"/>
-                <w:color w:val="1A1A1A"/>
-                <w:sz w:val="14"/>
-                <w:szCs w:val="14"/>
-              </w:rPr>
-              <w:t xml:space="preserve">Independent director and chair of the Directors' Committee</w:t>
-            </w:r>
-          </w:p>
-        </w:tc>
-      </w:tr>
-    </w:tbl>
+    <w:p>
+      <w:pPr>
+        <w:spacing w:after="30" w:before="20" w:line="228" w:lineRule="auto"/>
+      </w:pPr>
+      <w:r>
+        <w:rPr>
+          <w:rFonts w:ascii="Arial" w:cs="Arial" w:eastAsia="Arial" w:hAnsi="Arial"/>
+          <w:b/>
+          <w:bCs/>
+          <w:color w:val="14284B"/>
+          <w:sz w:val="14"/>
+          <w:szCs w:val="14"/>
+        </w:rPr>
+        <w:t xml:space="preserve">Figure S2: </w:t>
+      </w:r>
+      <w:r>
+        <w:rPr>
+          <w:rFonts w:ascii="Arial" w:cs="Arial" w:eastAsia="Arial" w:hAnsi="Arial"/>
+          <w:color w:val="14284B"/>
+          <w:sz w:val="14"/>
+          <w:szCs w:val="14"/>
+        </w:rPr>
+        <w:t xml:space="preserve">Board members (red: independent director; blue: chairman)</w:t>
+      </w:r>
+    </w:p>
+    <w:p>
+      <w:pPr>
+        <w:spacing w:after="20" w:before="0"/>
+      </w:pPr>
+      <w:r>
+        <w:drawing>
+          <wp:inline distT="0" distB="0" distL="0" distR="0">
+            <wp:extent cx="6772275" cy="1600200"/>
+            <wp:effectExtent t="0" r="0" b="0" l="0"/>
+            <wp:docPr id="1" name="" descr="" title=""/>
+            <wp:cNvGraphicFramePr>
+              <a:graphicFrameLocks xmlns:a="http://schemas.openxmlformats.org/drawingml/2006/main" noChangeAspect="1"/>
+            </wp:cNvGraphicFramePr>
+            <a:graphic xmlns:a="http://schemas.openxmlformats.org/drawingml/2006/main">
+              <a:graphicData uri="http://schemas.openxmlformats.org/drawingml/2006/picture">
+                <pic:pic xmlns:pic="http://schemas.openxmlformats.org/drawingml/2006/picture">
+                  <pic:nvPicPr>
+                    <pic:cNvPr id="0" name="" descr=""/>
+                    <pic:cNvPicPr>
+                      <a:picLocks noChangeAspect="1" noChangeArrowheads="1"/>
+                    </pic:cNvPicPr>
+                  </pic:nvPicPr>
+                  <pic:blipFill>
+                    <a:blip r:embed="rId17" cstate="none"/>
+                    <a:srcRect/>
+                    <a:stretch>
+                      <a:fillRect/>
+                    </a:stretch>
+                  </pic:blipFill>
+                  <pic:spPr bwMode="auto">
+                    <a:xfrm>
+                      <a:off x="0" y="0"/>
+                      <a:ext cx="6772275" cy="1600200"/>
+                    </a:xfrm>
+                    <a:prstGeom prst="rect">
+                      <a:avLst/>
+                    </a:prstGeom>
+                  </pic:spPr>
+                </pic:pic>
+              </a:graphicData>
+            </a:graphic>
+          </wp:inline>
+        </w:drawing>
+      </w:r>
+    </w:p>
     <w:p>
       <w:pPr>
         <w:spacing w:after="0" w:before="10" w:line="216" w:lineRule="auto"/>
@@ -4212,7 +3167,7 @@
           <w:sz w:val="14"/>
           <w:szCs w:val="14"/>
         </w:rPr>
-        <w:t xml:space="preserve">Figure S2: </w:t>
+        <w:t xml:space="preserve">Figure S3: </w:t>
       </w:r>
       <w:r>
         <w:rPr>
@@ -4247,7 +3202,7 @@
                     </pic:cNvPicPr>
                   </pic:nvPicPr>
                   <pic:blipFill>
-                    <a:blip r:embed="rId17" cstate="none"/>
+                    <a:blip r:embed="rId18" cstate="none"/>
                     <a:srcRect/>
                     <a:stretch>
                       <a:fillRect/>
@@ -4687,7 +3642,7 @@
                 <w:sz w:val="14"/>
                 <w:szCs w:val="14"/>
               </w:rPr>
-              <w:t xml:space="preserve">Figure S3: </w:t>
+              <w:t xml:space="preserve">Figure S4: </w:t>
             </w:r>
             <w:r>
               <w:rPr>
@@ -4722,7 +3677,7 @@
                           </pic:cNvPicPr>
                         </pic:nvPicPr>
                         <pic:blipFill>
-                          <a:blip r:embed="rId18" cstate="none"/>
+                          <a:blip r:embed="rId19" cstate="none"/>
                           <a:srcRect/>
                           <a:stretch>
                             <a:fillRect/>

</xml_diff>